<commit_message>
Italian Part 1: episodes 8-10, ep11 craft-time fix, combined Part 1 book PDF
Book cover now names the series language.

Co-Authored-By: Claude Opus 5.5 <noreply@anthropic.com>
Claude-Session: https://claude.ai/code/session_014Pwa4fJotSRvNewqVrvk7U
</commit_message>
<xml_diff>
--- a/business_it/part1/ep11_Videochiamata_con_Seul.docx
+++ b/business_it/part1/ep11_Videochiamata_con_Seul.docx
@@ -906,7 +906,7 @@
           <w:sz w:val="22"/>
         </w:rPr>
         <w:tab/>
-        <w:t>Io continuo a pensare che costi poco. Ci vogliono undici ore per farla.</w:t>
+        <w:t>Io continuo a pensare che costi poco. Ci vogliono undici passaggi a mano per farla.</w:t>
       </w:r>
     </w:p>
     <w:p>
@@ -932,7 +932,7 @@
           <w:sz w:val="22"/>
         </w:rPr>
         <w:tab/>
-        <w:t>Allora diglielo, con questo tono. Le undici ore sono il nostro argomento migliore.</w:t>
+        <w:t>Allora diglielo, con questo tono. Gli undici passaggi sono il nostro argomento migliore.</w:t>
       </w:r>
     </w:p>
     <w:p>
@@ -2002,7 +2002,7 @@
           <w:sz w:val="22"/>
         </w:rPr>
         <w:tab/>
-        <w:t>È in vacchetta conciata al vegetale. Ci vogliono undici ore di lavoro. Il bordo è tinto a mano, con tre passate.</w:t>
+        <w:t>È in vacchetta conciata al vegetale. Ci vogliono undici passaggi a mano. Il bordo è tinto a mano, con tre passate.</w:t>
       </w:r>
     </w:p>
     <w:p>
@@ -2028,7 +2028,7 @@
           <w:sz w:val="22"/>
         </w:rPr>
         <w:tab/>
-        <w:t>Undici ore. Questo me lo scrivo.</w:t>
+        <w:t>Undici passaggi. Questo me lo scrivo.</w:t>
       </w:r>
     </w:p>
     <w:p>
@@ -7780,7 +7780,7 @@
           <w:b/>
           <w:sz w:val="22"/>
         </w:rPr>
-        <w:t>Ci vuole / Ci vogliono: Ci vogliono undici ore per farla</w:t>
+        <w:t>Ci vuole / Ci vogliono: Ci vogliono undici passaggi per farla</w:t>
       </w:r>
     </w:p>
     <w:p>
@@ -7793,7 +7793,7 @@
           <w:rFonts w:ascii="Calibri" w:hAnsi="Calibri" w:eastAsia="Malgun Gothic"/>
           <w:sz w:val="20"/>
         </w:rPr>
-        <w:t>'(시간·양이) 필요하다'. 필요한 것이 단수면 ci vuole, 복수면 ci vogliono: Ci vuole un'ora / Ci vogliono undici ore. 주어 없이 쓰는 점에 주의(Io ho bisogno di…와 비교).</w:t>
+        <w:t>'(시간·양이) 필요하다'. 필요한 것이 단수면 ci vuole, 복수면 ci vogliono: Ci vuole un'ora / Ci vogliono undici passaggi. 주어 없이 쓰는 점에 주의(Io ho bisogno di…와 비교).</w:t>
       </w:r>
     </w:p>
     <w:p>
@@ -8601,7 +8601,7 @@
           <w:sz w:val="21"/>
         </w:rPr>
         <w:tab/>
-        <w:t>난 아직도 싸다고 생각해. 그거 하나 만드는 데 열한 시간 걸려.</w:t>
+        <w:t>난 아직도 싸다고 생각해. 그거 하나에 손으로 거치는 공정이 열한 단계야.</w:t>
       </w:r>
     </w:p>
     <w:p>
@@ -8627,7 +8627,7 @@
           <w:sz w:val="21"/>
         </w:rPr>
         <w:tab/>
-        <w:t>그럼 그 말투 그대로 말해. 열한 시간이 우리 최고의 무기야.</w:t>
+        <w:t>그럼 그 말투 그대로 말해. 열한 단계가 우리 최고의 무기야.</w:t>
       </w:r>
     </w:p>
     <w:p>
@@ -9698,7 +9698,7 @@
           <w:sz w:val="21"/>
         </w:rPr>
         <w:tab/>
-        <w:t>베지터블 무두질한 소가죽이에요. 작업 시간이 열한 시간 걸려요. 가장자리는 손으로 세 번 칠했고요.</w:t>
+        <w:t>베지터블 무두질한 소가죽이에요. 손으로 거치는 공정이 열한 단계예요. 가장자리는 손으로 세 번 칠했고요.</w:t>
       </w:r>
     </w:p>
     <w:p>
@@ -9724,7 +9724,7 @@
           <w:sz w:val="21"/>
         </w:rPr>
         <w:tab/>
-        <w:t>열한 시간. 이건 적어 둘게요.</w:t>
+        <w:t>열한 단계. 이건 적어 둘게요.</w:t>
       </w:r>
     </w:p>
     <w:p>

</xml_diff>